<commit_message>
Update Group 4 - Visualization Design Book.docx
</commit_message>
<xml_diff>
--- a/Project Stand Up 1/Group 4 - Visualization Design Book.docx
+++ b/Project Stand Up 1/Group 4 - Visualization Design Book.docx
@@ -37,6 +37,9 @@
           </w:tcPr>
           <w:p>
             <w:r>
+              <w:rPr>
+                <w:noProof/>
+              </w:rPr>
               <w:drawing>
                 <wp:inline distT="0" distB="0" distL="0" distR="0" wp14:anchorId="7ACB3641" wp14:editId="3C7E61CF">
                   <wp:extent cx="2838450" cy="1323975"/>
@@ -108,6 +111,9 @@
           <w:p/>
           <w:p>
             <w:r>
+              <w:rPr>
+                <w:noProof/>
+              </w:rPr>
               <w:drawing>
                 <wp:inline distT="0" distB="0" distL="0" distR="0" wp14:anchorId="60ED621C" wp14:editId="012E9CEA">
                   <wp:extent cx="2838450" cy="609600"/>
@@ -249,31 +255,7 @@
               <w:rPr>
                 <w:rFonts w:ascii="Times New Roman" w:hAnsi="Times New Roman" w:cs="Times New Roman"/>
               </w:rPr>
-              <w:t>COS</w:t>
-            </w:r>
-            <w:r>
-              <w:rPr>
-                <w:rFonts w:ascii="Times New Roman" w:hAnsi="Times New Roman" w:cs="Times New Roman"/>
-              </w:rPr>
-              <w:t>3</w:t>
-            </w:r>
-            <w:r>
-              <w:rPr>
-                <w:rFonts w:ascii="Times New Roman" w:hAnsi="Times New Roman" w:cs="Times New Roman"/>
-              </w:rPr>
-              <w:t>00</w:t>
-            </w:r>
-            <w:r>
-              <w:rPr>
-                <w:rFonts w:ascii="Times New Roman" w:hAnsi="Times New Roman" w:cs="Times New Roman"/>
-              </w:rPr>
-              <w:t>4</w:t>
-            </w:r>
-            <w:r>
-              <w:rPr>
-                <w:rFonts w:ascii="Times New Roman" w:hAnsi="Times New Roman" w:cs="Times New Roman"/>
-              </w:rPr>
-              <w:t>5</w:t>
+              <w:t>COS30045</w:t>
             </w:r>
           </w:p>
         </w:tc>
@@ -469,11 +451,18 @@
           </w:tcPr>
           <w:p>
             <w:pPr>
-              <w:spacing w:line="240" w:lineRule="auto"/>
+              <w:spacing w:line="360" w:lineRule="auto"/>
+              <w:jc w:val="both"/>
               <w:rPr>
                 <w:rFonts w:ascii="Times New Roman" w:hAnsi="Times New Roman" w:cs="Times New Roman"/>
               </w:rPr>
             </w:pPr>
+            <w:r>
+              <w:rPr>
+                <w:rFonts w:ascii="Times New Roman" w:hAnsi="Times New Roman" w:cs="Times New Roman"/>
+              </w:rPr>
+              <w:t>Beyond the Fine: Visualising the Disparities in Australian Road Enforcement Actions</w:t>
+            </w:r>
           </w:p>
         </w:tc>
       </w:tr>
@@ -541,19 +530,7 @@
               <w:rPr>
                 <w:rFonts w:ascii="Times New Roman" w:hAnsi="Times New Roman" w:cs="Times New Roman"/>
               </w:rPr>
-              <w:t xml:space="preserve">Monday </w:t>
-            </w:r>
-            <w:r>
-              <w:rPr>
-                <w:rFonts w:ascii="Times New Roman" w:hAnsi="Times New Roman" w:cs="Times New Roman"/>
-              </w:rPr>
-              <w:t>-</w:t>
-            </w:r>
-            <w:r>
-              <w:rPr>
-                <w:rFonts w:ascii="Times New Roman" w:hAnsi="Times New Roman" w:cs="Times New Roman"/>
-              </w:rPr>
-              <w:t xml:space="preserve"> Friday | 6:00pm to 10:00pm</w:t>
+              <w:t>Monday - Friday | 6:00pm to 10:00pm</w:t>
             </w:r>
           </w:p>
         </w:tc>
@@ -841,21 +818,48 @@
       </w:pPr>
     </w:p>
     <w:p>
-      <w:pPr>
-        <w:spacing w:line="240" w:lineRule="auto"/>
+      <w:r>
         <w:rPr>
           <w:b/>
           <w:bCs/>
         </w:rPr>
-      </w:pPr>
-    </w:p>
-    <w:p>
-      <w:r>
-        <w:rPr>
+        <w:t> </w:t>
+      </w:r>
+      <w:r>
+        <w:rPr>
+          <w:rFonts w:hint="eastAsia"/>
           <w:b/>
           <w:bCs/>
         </w:rPr>
-        <w:t> STUDENTS:</w:t>
+        <w:t>G</w:t>
+      </w:r>
+      <w:r>
+        <w:rPr>
+          <w:b/>
+          <w:bCs/>
+        </w:rPr>
+        <w:t xml:space="preserve">ROUP 4 </w:t>
+      </w:r>
+      <w:r>
+        <w:rPr>
+          <w:b/>
+          <w:bCs/>
+        </w:rPr>
+        <w:t>STUDENTS</w:t>
+      </w:r>
+      <w:r>
+        <w:rPr>
+          <w:b/>
+          <w:bCs/>
+        </w:rPr>
+        <w:t xml:space="preserve"> DETAILS</w:t>
+      </w:r>
+      <w:r>
+        <w:rPr>
+          <w:b/>
+          <w:bCs/>
+        </w:rPr>
+        <w:t>:</w:t>
       </w:r>
     </w:p>
     <w:tbl>
@@ -1083,9 +1087,11 @@
             <w:hideMark/>
           </w:tcPr>
           <w:p>
+            <w:proofErr w:type="spellStart"/>
             <w:r>
               <w:t>jin</w:t>
             </w:r>
+            <w:proofErr w:type="spellEnd"/>
           </w:p>
         </w:tc>
       </w:tr>
@@ -1201,9 +1207,11 @@
             <w:hideMark/>
           </w:tcPr>
           <w:p>
+            <w:proofErr w:type="spellStart"/>
             <w:r>
               <w:t>kuso</w:t>
             </w:r>
+            <w:proofErr w:type="spellEnd"/>
           </w:p>
         </w:tc>
       </w:tr>
@@ -1211,6 +1219,15 @@
     <w:p/>
     <w:sdt>
       <w:sdtPr>
+        <w:rPr>
+          <w:rFonts w:asciiTheme="minorHAnsi" w:eastAsiaTheme="minorEastAsia" w:hAnsiTheme="minorHAnsi" w:cstheme="minorBidi"/>
+          <w:color w:val="auto"/>
+          <w:kern w:val="2"/>
+          <w:sz w:val="24"/>
+          <w:szCs w:val="24"/>
+          <w:lang w:val="en-MY" w:eastAsia="zh-CN"/>
+          <w14:ligatures w14:val="standardContextual"/>
+        </w:rPr>
         <w:id w:val="986051505"/>
         <w:docPartObj>
           <w:docPartGallery w:val="Table of Contents"/>
@@ -1219,16 +1236,9 @@
       </w:sdtPr>
       <w:sdtEndPr>
         <w:rPr>
-          <w:rFonts w:asciiTheme="minorHAnsi" w:eastAsiaTheme="minorEastAsia" w:hAnsiTheme="minorHAnsi" w:cstheme="minorBidi"/>
           <w:b/>
           <w:bCs/>
           <w:noProof/>
-          <w:color w:val="auto"/>
-          <w:kern w:val="2"/>
-          <w:sz w:val="24"/>
-          <w:szCs w:val="24"/>
-          <w:lang w:val="en-MY" w:eastAsia="zh-CN"/>
-          <w14:ligatures w14:val="standardContextual"/>
         </w:rPr>
       </w:sdtEndPr>
       <w:sdtContent>
@@ -1488,7 +1498,7 @@
         <w:spacing w:line="360" w:lineRule="auto"/>
         <w:jc w:val="both"/>
         <w:rPr>
-          <w:rFonts w:ascii="Times New Roman" w:hAnsi="Times New Roman" w:cs="Times New Roman" w:hint="eastAsia"/>
+          <w:rFonts w:ascii="Times New Roman" w:hAnsi="Times New Roman" w:cs="Times New Roman"/>
         </w:rPr>
       </w:pPr>
     </w:p>
@@ -1949,19 +1959,21 @@
         <w:rPr>
           <w:rFonts w:ascii="Times New Roman" w:hAnsi="Times New Roman" w:cs="Times New Roman"/>
         </w:rPr>
-        <w:t xml:space="preserve"> Traditional dashboards just count the total number of fines </w:t>
-      </w:r>
-      <w:r>
-        <w:rPr>
-          <w:rFonts w:ascii="Times New Roman" w:hAnsi="Times New Roman" w:cs="Times New Roman"/>
-        </w:rPr>
-        <w:t>issued;</w:t>
-      </w:r>
-      <w:r>
-        <w:rPr>
-          <w:rFonts w:ascii="Times New Roman" w:hAnsi="Times New Roman" w:cs="Times New Roman"/>
-        </w:rPr>
-        <w:t xml:space="preserve"> However, permit visualization allows us to visualize the context of enforcement, specifically the severity of the final outcome (fine vs. arrest). This is critical for measuring whether the use of automated cameras is producing only revenue, and if the manual intervention of the police effectively addresses high-risk and repeat offender behaviour.</w:t>
+        <w:t xml:space="preserve"> Traditional dashboards just count the total number of fines issued; However, permit visualization allows us to visualize the context of enforcement, specifically the severity of the </w:t>
+      </w:r>
+      <w:proofErr w:type="gramStart"/>
+      <w:r>
+        <w:rPr>
+          <w:rFonts w:ascii="Times New Roman" w:hAnsi="Times New Roman" w:cs="Times New Roman"/>
+        </w:rPr>
+        <w:t>final outcome</w:t>
+      </w:r>
+      <w:proofErr w:type="gramEnd"/>
+      <w:r>
+        <w:rPr>
+          <w:rFonts w:ascii="Times New Roman" w:hAnsi="Times New Roman" w:cs="Times New Roman"/>
+        </w:rPr>
+        <w:t xml:space="preserve"> (fine vs. arrest). This is critical for measuring whether the use of automated cameras is producing only revenue, and if the manual intervention of the police effectively addresses high-risk and repeat offender behaviour.</w:t>
       </w:r>
     </w:p>
     <w:p>
@@ -1989,15 +2001,7 @@
           <w:b/>
           <w:bCs/>
         </w:rPr>
-        <w:t>Key User Tasks</w:t>
-      </w:r>
-      <w:r>
-        <w:rPr>
-          <w:rFonts w:ascii="Times New Roman" w:hAnsi="Times New Roman" w:cs="Times New Roman"/>
-          <w:b/>
-          <w:bCs/>
-        </w:rPr>
-        <w:t>:</w:t>
+        <w:t>Key User Tasks:</w:t>
       </w:r>
     </w:p>
     <w:p>
@@ -2077,7 +2081,21 @@
         <w:rPr>
           <w:rFonts w:ascii="Times New Roman" w:hAnsi="Times New Roman" w:cs="Times New Roman"/>
         </w:rPr>
-        <w:t>Examine changes in temporal offenses for purpose of determining whether there are seasonal changes or longitudinal trends in driver behavior.</w:t>
+        <w:t xml:space="preserve">Examine changes in temporal offenses for purpose of determining whether there are seasonal changes or longitudinal trends in driver </w:t>
+      </w:r>
+      <w:proofErr w:type="spellStart"/>
+      <w:r>
+        <w:rPr>
+          <w:rFonts w:ascii="Times New Roman" w:hAnsi="Times New Roman" w:cs="Times New Roman"/>
+        </w:rPr>
+        <w:t>behavior</w:t>
+      </w:r>
+      <w:proofErr w:type="spellEnd"/>
+      <w:r>
+        <w:rPr>
+          <w:rFonts w:ascii="Times New Roman" w:hAnsi="Times New Roman" w:cs="Times New Roman"/>
+        </w:rPr>
+        <w:t>.</w:t>
       </w:r>
     </w:p>
     <w:p>
@@ -2477,19 +2495,7 @@
         <w:rPr>
           <w:rFonts w:ascii="Times New Roman" w:hAnsi="Times New Roman" w:cs="Times New Roman"/>
         </w:rPr>
-        <w:t xml:space="preserve">the dashboard actively shifts the policy narrative away from revenue generation and toward genuine crime deterrence and </w:t>
-      </w:r>
-      <w:r>
-        <w:rPr>
-          <w:rFonts w:ascii="Times New Roman" w:hAnsi="Times New Roman" w:cs="Times New Roman"/>
-        </w:rPr>
-        <w:t>behavioural</w:t>
-      </w:r>
-      <w:r>
-        <w:rPr>
-          <w:rFonts w:ascii="Times New Roman" w:hAnsi="Times New Roman" w:cs="Times New Roman"/>
-        </w:rPr>
-        <w:t xml:space="preserve"> change, ultimately supporting more effective road safety strategies.</w:t>
+        <w:t>the dashboard actively shifts the policy narrative away from revenue generation and toward genuine crime deterrence and behavioural change, ultimately supporting more effective road safety strategies.</w:t>
       </w:r>
     </w:p>
     <w:sectPr>
@@ -4684,6 +4690,7 @@
   <w:style w:type="character" w:default="1" w:styleId="DefaultParagraphFont">
     <w:name w:val="Default Paragraph Font"/>
     <w:uiPriority w:val="1"/>
+    <w:semiHidden/>
     <w:unhideWhenUsed/>
   </w:style>
   <w:style w:type="table" w:default="1" w:styleId="TableNormal">

</xml_diff>